<commit_message>
Atualizar visibilidade e manuais
</commit_message>
<xml_diff>
--- a/Manual/Ufcd 0754 Manual.docx
+++ b/Manual/Ufcd 0754 Manual.docx
@@ -31,10 +31,12 @@
           <w:lang w:val="pt-PT"/>
         </w:rPr>
         <w:sectPr>
-          <w:headerReference w:type="default" r:id="rId8"/>
-          <w:footerReference w:type="default" r:id="rId9"/>
-          <w:headerReference w:type="first" r:id="rId10"/>
-          <w:footerReference w:type="first" r:id="rId11"/>
+          <w:headerReference w:type="even" r:id="rId8"/>
+          <w:headerReference w:type="default" r:id="rId9"/>
+          <w:footerReference w:type="even" r:id="rId10"/>
+          <w:footerReference w:type="default" r:id="rId11"/>
+          <w:headerReference w:type="first" r:id="rId12"/>
+          <w:footerReference w:type="first" r:id="rId13"/>
           <w:pgSz w:w="11906" w:h="16838" w:code="9"/>
           <w:pgMar w:top="2756" w:right="1134" w:bottom="1559" w:left="1134" w:header="992" w:footer="720" w:gutter="0"/>
           <w:cols w:space="720"/>
@@ -517,7 +519,25 @@
                 <w:sz w:val="20"/>
                 <w:szCs w:val="24"/>
               </w:rPr>
-              <w:t xml:space="preserve"> tem caráter classificativo.</w:t>
+              <w:t xml:space="preserve"> </w:t>
+            </w:r>
+            <w:proofErr w:type="spellStart"/>
+            <w:r>
+              <w:rPr>
+                <w:rFonts w:ascii="Segoe UI Emoji" w:hAnsi="Segoe UI Emoji"/>
+                <w:sz w:val="20"/>
+                <w:szCs w:val="24"/>
+              </w:rPr>
+              <w:t>tem</w:t>
+            </w:r>
+            <w:proofErr w:type="spellEnd"/>
+            <w:r>
+              <w:rPr>
+                <w:rFonts w:ascii="Segoe UI Emoji" w:hAnsi="Segoe UI Emoji"/>
+                <w:sz w:val="20"/>
+                <w:szCs w:val="24"/>
+              </w:rPr>
+              <w:t xml:space="preserve"> caráter classificativo.</w:t>
             </w:r>
           </w:p>
         </w:tc>
@@ -690,6 +710,8 @@
       <w:sdtPr>
         <w:rPr>
           <w:rFonts w:ascii="Segoe UI Emoji" w:hAnsi="Segoe UI Emoji"/>
+          <w:b w:val="0"/>
+          <w:color w:val="1F2937"/>
           <w:sz w:val="72"/>
           <w:szCs w:val="32"/>
           <w:lang w:val="pt-PT"/>
@@ -704,7 +726,6 @@
         <w:rPr>
           <w:rFonts w:ascii="Aptos" w:hAnsi="Aptos"/>
           <w:bCs/>
-          <w:color w:val="1F2937"/>
           <w:sz w:val="17"/>
           <w:szCs w:val="22"/>
           <w:lang w:val="en-US"/>
@@ -8094,6 +8115,11 @@
           </w:hyperlink>
         </w:p>
         <w:p>
+          <w:pPr>
+            <w:rPr>
+              <w:rFonts w:hint="eastAsia"/>
+            </w:rPr>
+          </w:pPr>
           <w:r>
             <w:rPr>
               <w:rFonts w:ascii="Segoe UI Emoji" w:hAnsi="Segoe UI Emoji"/>
@@ -8128,9 +8154,9 @@
           <w:lang w:val="pt-PT"/>
         </w:rPr>
         <w:sectPr>
-          <w:footerReference w:type="default" r:id="rId12"/>
-          <w:headerReference w:type="first" r:id="rId13"/>
-          <w:footerReference w:type="first" r:id="rId14"/>
+          <w:footerReference w:type="default" r:id="rId14"/>
+          <w:headerReference w:type="first" r:id="rId15"/>
+          <w:footerReference w:type="first" r:id="rId16"/>
           <w:type w:val="continuous"/>
           <w:pgSz w:w="11906" w:h="16838" w:code="9"/>
           <w:pgMar w:top="765" w:right="1134" w:bottom="993" w:left="1134" w:header="720" w:footer="720" w:gutter="0"/>
@@ -9228,12 +9254,10 @@
         <w:pStyle w:val="Ttulo2"/>
       </w:pPr>
       <w:bookmarkStart w:id="5" w:name="_Toc235378055"/>
-      <w:proofErr w:type="spellStart"/>
       <w:r>
         <w:t>Consolidação</w:t>
       </w:r>
       <w:bookmarkEnd w:id="5"/>
-      <w:proofErr w:type="spellEnd"/>
     </w:p>
     <w:tbl>
       <w:tblPr>
@@ -10308,20 +10332,10 @@
         <w:pStyle w:val="Ttulo2"/>
       </w:pPr>
       <w:bookmarkStart w:id="9" w:name="_Toc235378059"/>
-      <w:proofErr w:type="spellStart"/>
-      <w:r>
-        <w:t>Anular</w:t>
-      </w:r>
-      <w:proofErr w:type="spellEnd"/>
-      <w:r>
-        <w:t xml:space="preserve"> e </w:t>
-      </w:r>
-      <w:proofErr w:type="spellStart"/>
-      <w:r>
-        <w:t>repetir</w:t>
+      <w:r>
+        <w:t>Anular e repetir</w:t>
       </w:r>
       <w:bookmarkEnd w:id="9"/>
-      <w:proofErr w:type="spellEnd"/>
     </w:p>
     <w:p>
       <w:pPr>
@@ -10479,12 +10493,10 @@
         <w:pStyle w:val="Ttulo2"/>
       </w:pPr>
       <w:bookmarkStart w:id="10" w:name="_Toc235378060"/>
-      <w:proofErr w:type="spellStart"/>
       <w:r>
         <w:t>Consolidação</w:t>
       </w:r>
       <w:bookmarkEnd w:id="10"/>
-      <w:proofErr w:type="spellEnd"/>
     </w:p>
     <w:tbl>
       <w:tblPr>
@@ -11307,12 +11319,10 @@
         <w:pStyle w:val="Ttulo2"/>
       </w:pPr>
       <w:bookmarkStart w:id="16" w:name="_Toc235378066"/>
-      <w:proofErr w:type="spellStart"/>
       <w:r>
         <w:t>Consolidação</w:t>
       </w:r>
       <w:bookmarkEnd w:id="16"/>
-      <w:proofErr w:type="spellEnd"/>
     </w:p>
     <w:tbl>
       <w:tblPr>
@@ -12659,12 +12669,10 @@
         <w:pStyle w:val="Ttulo2"/>
       </w:pPr>
       <w:bookmarkStart w:id="22" w:name="_Toc235378072"/>
-      <w:proofErr w:type="spellStart"/>
       <w:r>
         <w:t>Consolidação</w:t>
       </w:r>
       <w:bookmarkEnd w:id="22"/>
-      <w:proofErr w:type="spellEnd"/>
     </w:p>
     <w:tbl>
       <w:tblPr>
@@ -13399,12 +13407,10 @@
         <w:pStyle w:val="Ttulo2"/>
       </w:pPr>
       <w:bookmarkStart w:id="27" w:name="_Toc235378077"/>
-      <w:proofErr w:type="spellStart"/>
       <w:r>
         <w:t>Consolidação</w:t>
       </w:r>
       <w:bookmarkEnd w:id="27"/>
-      <w:proofErr w:type="spellEnd"/>
     </w:p>
     <w:tbl>
       <w:tblPr>
@@ -13511,7 +13517,43 @@
                 <w:sz w:val="20"/>
                 <w:szCs w:val="24"/>
               </w:rPr>
-              <w:t xml:space="preserve"> duas verificações efetuadas.</w:t>
+              <w:t xml:space="preserve"> duas </w:t>
+            </w:r>
+            <w:proofErr w:type="spellStart"/>
+            <w:r>
+              <w:rPr>
+                <w:rFonts w:ascii="Segoe UI Emoji" w:hAnsi="Segoe UI Emoji"/>
+                <w:sz w:val="20"/>
+                <w:szCs w:val="24"/>
+              </w:rPr>
+              <w:t>verificações</w:t>
+            </w:r>
+            <w:proofErr w:type="spellEnd"/>
+            <w:r>
+              <w:rPr>
+                <w:rFonts w:ascii="Segoe UI Emoji" w:hAnsi="Segoe UI Emoji"/>
+                <w:sz w:val="20"/>
+                <w:szCs w:val="24"/>
+              </w:rPr>
+              <w:t xml:space="preserve"> </w:t>
+            </w:r>
+            <w:proofErr w:type="spellStart"/>
+            <w:r>
+              <w:rPr>
+                <w:rFonts w:ascii="Segoe UI Emoji" w:hAnsi="Segoe UI Emoji"/>
+                <w:sz w:val="20"/>
+                <w:szCs w:val="24"/>
+              </w:rPr>
+              <w:t>efetuadas</w:t>
+            </w:r>
+            <w:proofErr w:type="spellEnd"/>
+            <w:r>
+              <w:rPr>
+                <w:rFonts w:ascii="Segoe UI Emoji" w:hAnsi="Segoe UI Emoji"/>
+                <w:sz w:val="20"/>
+                <w:szCs w:val="24"/>
+              </w:rPr>
+              <w:t>.</w:t>
             </w:r>
           </w:p>
         </w:tc>
@@ -14220,12 +14262,10 @@
         <w:pStyle w:val="Ttulo2"/>
       </w:pPr>
       <w:bookmarkStart w:id="32" w:name="_Toc235378082"/>
-      <w:proofErr w:type="spellStart"/>
       <w:r>
         <w:t>Consolidação</w:t>
       </w:r>
       <w:bookmarkEnd w:id="32"/>
-      <w:proofErr w:type="spellEnd"/>
     </w:p>
     <w:tbl>
       <w:tblPr>
@@ -15107,12 +15147,10 @@
         <w:pStyle w:val="Ttulo2"/>
       </w:pPr>
       <w:bookmarkStart w:id="38" w:name="_Toc235378088"/>
-      <w:proofErr w:type="spellStart"/>
       <w:r>
         <w:t>Consolidação</w:t>
       </w:r>
       <w:bookmarkEnd w:id="38"/>
-      <w:proofErr w:type="spellEnd"/>
     </w:p>
     <w:tbl>
       <w:tblPr>
@@ -15954,12 +15992,10 @@
         <w:pStyle w:val="Ttulo2"/>
       </w:pPr>
       <w:bookmarkStart w:id="43" w:name="_Toc235378093"/>
-      <w:proofErr w:type="spellStart"/>
       <w:r>
         <w:t>Consolidação</w:t>
       </w:r>
       <w:bookmarkEnd w:id="43"/>
-      <w:proofErr w:type="spellEnd"/>
     </w:p>
     <w:tbl>
       <w:tblPr>
@@ -16933,27 +16969,19 @@
           <w:rFonts w:ascii="Segoe UI Emoji" w:hAnsi="Segoe UI Emoji"/>
           <w:sz w:val="52"/>
           <w:szCs w:val="24"/>
+          <w:lang w:val="pt-PT"/>
         </w:rPr>
       </w:pPr>
       <w:bookmarkStart w:id="51" w:name="_Toc235378101"/>
-      <w:proofErr w:type="spellStart"/>
       <w:r>
         <w:rPr>
           <w:rFonts w:ascii="Segoe UI Emoji" w:hAnsi="Segoe UI Emoji"/>
           <w:sz w:val="52"/>
           <w:szCs w:val="24"/>
+          <w:lang w:val="pt-PT"/>
         </w:rPr>
         <w:lastRenderedPageBreak/>
-        <w:t>Projeto</w:t>
-      </w:r>
-      <w:proofErr w:type="spellEnd"/>
-      <w:r>
-        <w:rPr>
-          <w:rFonts w:ascii="Segoe UI Emoji" w:hAnsi="Segoe UI Emoji"/>
-          <w:sz w:val="52"/>
-          <w:szCs w:val="24"/>
-        </w:rPr>
-        <w:t xml:space="preserve"> final individual</w:t>
+        <w:t>Projeto final individual</w:t>
       </w:r>
       <w:bookmarkEnd w:id="51"/>
     </w:p>
@@ -20032,7 +20060,7 @@
       <w:pPr>
         <w:pStyle w:val="Ttulo2"/>
         <w:sectPr>
-          <w:footerReference w:type="first" r:id="rId15"/>
+          <w:footerReference w:type="first" r:id="rId17"/>
           <w:pgSz w:w="11906" w:h="16838" w:code="9"/>
           <w:pgMar w:top="765" w:right="1134" w:bottom="993" w:left="1134" w:header="720" w:footer="720" w:gutter="0"/>
           <w:pgNumType w:start="1"/>
@@ -20847,6 +20875,7 @@
       <w:pPr>
         <w:pStyle w:val="Ttulo1"/>
         <w:rPr>
+          <w:rFonts w:hint="eastAsia"/>
           <w:lang w:val="pt-PT" w:eastAsia="pt-PT"/>
         </w:rPr>
       </w:pPr>
@@ -20971,19 +21000,35 @@
         </w:rPr>
         <w:br/>
       </w:r>
-      <w:hyperlink r:id="rId16" w:tgtFrame="_new" w:history="1">
-        <w:r>
-          <w:rPr>
-            <w:rFonts w:ascii="Segoe UI Emoji" w:eastAsia="Times New Roman" w:hAnsi="Segoe UI Emoji" w:cs="Times New Roman"/>
-            <w:color w:val="0000FF"/>
-            <w:sz w:val="24"/>
-            <w:szCs w:val="24"/>
-            <w:u w:val="single"/>
-            <w:lang w:val="pt-PT" w:eastAsia="pt-PT"/>
-          </w:rPr>
-          <w:t>https://catalogo.snq.gov.pt/ufcdDetalhe/739</w:t>
-        </w:r>
-      </w:hyperlink>
+      <w:r>
+        <w:fldChar w:fldCharType="begin"/>
+      </w:r>
+      <w:r>
+        <w:rPr>
+          <w:lang w:val="pt-PT"/>
+        </w:rPr>
+        <w:instrText>HYPERLINK "https://catalogo.snq.gov.pt/ufcdDetalhe/739" \t "_new"</w:instrText>
+      </w:r>
+      <w:r>
+        <w:rPr>
+          <w:rFonts w:hint="eastAsia"/>
+        </w:rPr>
+        <w:fldChar w:fldCharType="separate"/>
+      </w:r>
+      <w:r>
+        <w:rPr>
+          <w:rFonts w:ascii="Segoe UI Emoji" w:eastAsia="Times New Roman" w:hAnsi="Segoe UI Emoji" w:cs="Times New Roman"/>
+          <w:color w:val="0000FF"/>
+          <w:sz w:val="24"/>
+          <w:szCs w:val="24"/>
+          <w:u w:val="single"/>
+          <w:lang w:val="pt-PT" w:eastAsia="pt-PT"/>
+        </w:rPr>
+        <w:t>https://catalogo.snq.gov.pt/ufcdDetalhe/739</w:t>
+      </w:r>
+      <w:r>
+        <w:fldChar w:fldCharType="end"/>
+      </w:r>
       <w:r>
         <w:rPr>
           <w:rFonts w:ascii="Segoe UI Emoji" w:eastAsia="Times New Roman" w:hAnsi="Segoe UI Emoji" w:cs="Times New Roman"/>
@@ -21456,19 +21501,35 @@
         </w:rPr>
         <w:br/>
       </w:r>
-      <w:hyperlink r:id="rId17" w:tgtFrame="_new" w:history="1">
-        <w:r>
-          <w:rPr>
-            <w:rFonts w:ascii="Segoe UI Emoji" w:eastAsia="Times New Roman" w:hAnsi="Segoe UI Emoji" w:cs="Times New Roman"/>
-            <w:color w:val="0000FF"/>
-            <w:sz w:val="24"/>
-            <w:szCs w:val="24"/>
-            <w:u w:val="single"/>
-            <w:lang w:val="pt-PT" w:eastAsia="pt-PT"/>
-          </w:rPr>
-          <w:t>https://support.microsoft.com/pt-pt/word</w:t>
-        </w:r>
-      </w:hyperlink>
+      <w:r>
+        <w:fldChar w:fldCharType="begin"/>
+      </w:r>
+      <w:r>
+        <w:rPr>
+          <w:lang w:val="pt-PT"/>
+        </w:rPr>
+        <w:instrText>HYPERLINK "https://support.microsoft.com/pt-pt/word?utm_source=chatgpt.com" \t "_new"</w:instrText>
+      </w:r>
+      <w:r>
+        <w:rPr>
+          <w:rFonts w:hint="eastAsia"/>
+        </w:rPr>
+        <w:fldChar w:fldCharType="separate"/>
+      </w:r>
+      <w:r>
+        <w:rPr>
+          <w:rFonts w:ascii="Segoe UI Emoji" w:eastAsia="Times New Roman" w:hAnsi="Segoe UI Emoji" w:cs="Times New Roman"/>
+          <w:color w:val="0000FF"/>
+          <w:sz w:val="24"/>
+          <w:szCs w:val="24"/>
+          <w:u w:val="single"/>
+          <w:lang w:val="pt-PT" w:eastAsia="pt-PT"/>
+        </w:rPr>
+        <w:t>https://support.microsoft.com/pt-pt/word</w:t>
+      </w:r>
+      <w:r>
+        <w:fldChar w:fldCharType="end"/>
+      </w:r>
       <w:r>
         <w:rPr>
           <w:rFonts w:ascii="Segoe UI Emoji" w:eastAsia="Times New Roman" w:hAnsi="Segoe UI Emoji" w:cs="Times New Roman"/>
@@ -21581,19 +21642,35 @@
         </w:rPr>
         <w:br/>
       </w:r>
-      <w:hyperlink r:id="rId18" w:tgtFrame="_new" w:history="1">
-        <w:r>
-          <w:rPr>
-            <w:rFonts w:ascii="Segoe UI Emoji" w:eastAsia="Times New Roman" w:hAnsi="Segoe UI Emoji" w:cs="Times New Roman"/>
-            <w:color w:val="0000FF"/>
-            <w:sz w:val="24"/>
-            <w:szCs w:val="24"/>
-            <w:u w:val="single"/>
-            <w:lang w:val="pt-PT" w:eastAsia="pt-PT"/>
-          </w:rPr>
-          <w:t>https://support.microsoft.com/pt-pt/word/format-or-customize-a-table-of-contents-in-word</w:t>
-        </w:r>
-      </w:hyperlink>
+      <w:r>
+        <w:fldChar w:fldCharType="begin"/>
+      </w:r>
+      <w:r>
+        <w:rPr>
+          <w:lang w:val="pt-PT"/>
+        </w:rPr>
+        <w:instrText>HYPERLINK "https://support.microsoft.com/pt-pt/word/format-or-customize-a-table-of-contents-in-word?utm_source=chatgpt.com" \t "_new"</w:instrText>
+      </w:r>
+      <w:r>
+        <w:rPr>
+          <w:rFonts w:hint="eastAsia"/>
+        </w:rPr>
+        <w:fldChar w:fldCharType="separate"/>
+      </w:r>
+      <w:r>
+        <w:rPr>
+          <w:rFonts w:ascii="Segoe UI Emoji" w:eastAsia="Times New Roman" w:hAnsi="Segoe UI Emoji" w:cs="Times New Roman"/>
+          <w:color w:val="0000FF"/>
+          <w:sz w:val="24"/>
+          <w:szCs w:val="24"/>
+          <w:u w:val="single"/>
+          <w:lang w:val="pt-PT" w:eastAsia="pt-PT"/>
+        </w:rPr>
+        <w:t>https://support.microsoft.com/pt-pt/word/format-or-customize-a-table-of-contents-in-word</w:t>
+      </w:r>
+      <w:r>
+        <w:fldChar w:fldCharType="end"/>
+      </w:r>
       <w:r>
         <w:rPr>
           <w:rFonts w:ascii="Segoe UI Emoji" w:eastAsia="Times New Roman" w:hAnsi="Segoe UI Emoji" w:cs="Times New Roman"/>
@@ -21706,19 +21783,35 @@
         </w:rPr>
         <w:br/>
       </w:r>
-      <w:hyperlink r:id="rId19" w:tgtFrame="_new" w:history="1">
-        <w:r>
-          <w:rPr>
-            <w:rFonts w:ascii="Segoe UI Emoji" w:eastAsia="Times New Roman" w:hAnsi="Segoe UI Emoji" w:cs="Times New Roman"/>
-            <w:color w:val="0000FF"/>
-            <w:sz w:val="24"/>
-            <w:szCs w:val="24"/>
-            <w:u w:val="single"/>
-            <w:lang w:val="pt-PT" w:eastAsia="pt-PT"/>
-          </w:rPr>
-          <w:t>https://support.microsoft.com/pt-pt/word/update-a-table-of-contents</w:t>
-        </w:r>
-      </w:hyperlink>
+      <w:r>
+        <w:fldChar w:fldCharType="begin"/>
+      </w:r>
+      <w:r>
+        <w:rPr>
+          <w:lang w:val="pt-PT"/>
+        </w:rPr>
+        <w:instrText>HYPERLINK "https://support.microsoft.com/pt-pt/word/update-a-table-of-contents" \t "_new"</w:instrText>
+      </w:r>
+      <w:r>
+        <w:rPr>
+          <w:rFonts w:hint="eastAsia"/>
+        </w:rPr>
+        <w:fldChar w:fldCharType="separate"/>
+      </w:r>
+      <w:r>
+        <w:rPr>
+          <w:rFonts w:ascii="Segoe UI Emoji" w:eastAsia="Times New Roman" w:hAnsi="Segoe UI Emoji" w:cs="Times New Roman"/>
+          <w:color w:val="0000FF"/>
+          <w:sz w:val="24"/>
+          <w:szCs w:val="24"/>
+          <w:u w:val="single"/>
+          <w:lang w:val="pt-PT" w:eastAsia="pt-PT"/>
+        </w:rPr>
+        <w:t>https://support.microsoft.com/pt-pt/word/update-a-table-of-contents</w:t>
+      </w:r>
+      <w:r>
+        <w:fldChar w:fldCharType="end"/>
+      </w:r>
       <w:r>
         <w:rPr>
           <w:rFonts w:ascii="Segoe UI Emoji" w:eastAsia="Times New Roman" w:hAnsi="Segoe UI Emoji" w:cs="Times New Roman"/>
@@ -21831,19 +21924,35 @@
         </w:rPr>
         <w:br/>
       </w:r>
-      <w:hyperlink r:id="rId20" w:tgtFrame="_new" w:history="1">
-        <w:r>
-          <w:rPr>
-            <w:rFonts w:ascii="Segoe UI Emoji" w:eastAsia="Times New Roman" w:hAnsi="Segoe UI Emoji" w:cs="Times New Roman"/>
-            <w:color w:val="0000FF"/>
-            <w:sz w:val="24"/>
-            <w:szCs w:val="24"/>
-            <w:u w:val="single"/>
-            <w:lang w:val="pt-PT" w:eastAsia="pt-PT"/>
-          </w:rPr>
-          <w:t>https://support.microsoft.com/pt-pt/word/create-a-cross-reference</w:t>
-        </w:r>
-      </w:hyperlink>
+      <w:r>
+        <w:fldChar w:fldCharType="begin"/>
+      </w:r>
+      <w:r>
+        <w:rPr>
+          <w:lang w:val="pt-PT"/>
+        </w:rPr>
+        <w:instrText>HYPERLINK "https://support.microsoft.com/pt-pt/word/create-a-cross-reference" \t "_new"</w:instrText>
+      </w:r>
+      <w:r>
+        <w:rPr>
+          <w:rFonts w:hint="eastAsia"/>
+        </w:rPr>
+        <w:fldChar w:fldCharType="separate"/>
+      </w:r>
+      <w:r>
+        <w:rPr>
+          <w:rFonts w:ascii="Segoe UI Emoji" w:eastAsia="Times New Roman" w:hAnsi="Segoe UI Emoji" w:cs="Times New Roman"/>
+          <w:color w:val="0000FF"/>
+          <w:sz w:val="24"/>
+          <w:szCs w:val="24"/>
+          <w:u w:val="single"/>
+          <w:lang w:val="pt-PT" w:eastAsia="pt-PT"/>
+        </w:rPr>
+        <w:t>https://support.microsoft.com/pt-pt/word/create-a-cross-reference</w:t>
+      </w:r>
+      <w:r>
+        <w:fldChar w:fldCharType="end"/>
+      </w:r>
       <w:r>
         <w:rPr>
           <w:rFonts w:ascii="Segoe UI Emoji" w:eastAsia="Times New Roman" w:hAnsi="Segoe UI Emoji" w:cs="Times New Roman"/>
@@ -21956,19 +22065,35 @@
         </w:rPr>
         <w:br/>
       </w:r>
-      <w:hyperlink r:id="rId21" w:tgtFrame="_new" w:history="1">
-        <w:r>
-          <w:rPr>
-            <w:rFonts w:ascii="Segoe UI Emoji" w:eastAsia="Times New Roman" w:hAnsi="Segoe UI Emoji" w:cs="Times New Roman"/>
-            <w:color w:val="0000FF"/>
-            <w:sz w:val="24"/>
-            <w:szCs w:val="24"/>
-            <w:u w:val="single"/>
-            <w:lang w:val="pt-PT" w:eastAsia="pt-PT"/>
-          </w:rPr>
-          <w:t>https://support.microsoft.com/pt-pt/office/utilizar-um-leitor-de-ecr%C3%A3-para-criar-cabe%C3%A7alhos-e-rodap%C3%A9s-no-word-7a61ea68-8cf2-48eb-a693-fda2bb7f311f</w:t>
-        </w:r>
-      </w:hyperlink>
+      <w:r>
+        <w:fldChar w:fldCharType="begin"/>
+      </w:r>
+      <w:r>
+        <w:rPr>
+          <w:lang w:val="pt-PT"/>
+        </w:rPr>
+        <w:instrText>HYPERLINK "https://support.microsoft.com/pt-pt/office/utilizar-um-leitor-de-ecr%C3%A3-para-criar-cabe%C3%A7alhos-e-rodap%C3%A9s-no-word-7a61ea68-8cf2-48eb-a693-fda2bb7f311f?utm_source=chatgpt.com" \t "_new"</w:instrText>
+      </w:r>
+      <w:r>
+        <w:rPr>
+          <w:rFonts w:hint="eastAsia"/>
+        </w:rPr>
+        <w:fldChar w:fldCharType="separate"/>
+      </w:r>
+      <w:r>
+        <w:rPr>
+          <w:rFonts w:ascii="Segoe UI Emoji" w:eastAsia="Times New Roman" w:hAnsi="Segoe UI Emoji" w:cs="Times New Roman"/>
+          <w:color w:val="0000FF"/>
+          <w:sz w:val="24"/>
+          <w:szCs w:val="24"/>
+          <w:u w:val="single"/>
+          <w:lang w:val="pt-PT" w:eastAsia="pt-PT"/>
+        </w:rPr>
+        <w:t>https://support.microsoft.com/pt-pt/office/utilizar-um-leitor-de-ecr%C3%A3-para-criar-cabe%C3%A7alhos-e-rodap%C3%A9s-no-word-7a61ea68-8cf2-48eb-a693-fda2bb7f311f</w:t>
+      </w:r>
+      <w:r>
+        <w:fldChar w:fldCharType="end"/>
+      </w:r>
       <w:r>
         <w:rPr>
           <w:rFonts w:ascii="Segoe UI Emoji" w:eastAsia="Times New Roman" w:hAnsi="Segoe UI Emoji" w:cs="Times New Roman"/>
@@ -22082,6 +22207,9 @@
     <w:p>
       <w:pPr>
         <w:spacing w:after="0"/>
+        <w:rPr>
+          <w:rFonts w:hint="eastAsia"/>
+        </w:rPr>
       </w:pPr>
       <w:r>
         <w:separator/>
@@ -22092,6 +22220,9 @@
     <w:p>
       <w:pPr>
         <w:spacing w:after="0"/>
+        <w:rPr>
+          <w:rFonts w:hint="eastAsia"/>
+        </w:rPr>
       </w:pPr>
       <w:r>
         <w:continuationSeparator/>
@@ -22106,7 +22237,23 @@
   <w:p>
     <w:pPr>
       <w:pStyle w:val="Rodap"/>
+      <w:rPr>
+        <w:rFonts w:hint="eastAsia"/>
+      </w:rPr>
+    </w:pPr>
+  </w:p>
+</w:ftr>
+</file>
+
+<file path=word/footer2.xml><?xml version="1.0" encoding="utf-8"?>
+<w:ftr xmlns:wpc="http://schemas.microsoft.com/office/word/2010/wordprocessingCanvas" xmlns:cx="http://schemas.microsoft.com/office/drawing/2014/chartex" xmlns:cx1="http://schemas.microsoft.com/office/drawing/2015/9/8/chartex" xmlns:cx2="http://schemas.microsoft.com/office/drawing/2015/10/21/chartex" xmlns:cx3="http://schemas.microsoft.com/office/drawing/2016/5/9/chartex" xmlns:cx4="http://schemas.microsoft.com/office/drawing/2016/5/10/chartex" xmlns:cx5="http://schemas.microsoft.com/office/drawing/2016/5/11/chartex" xmlns:cx6="http://schemas.microsoft.com/office/drawing/2016/5/12/chartex" xmlns:cx7="http://schemas.microsoft.com/office/drawing/2016/5/13/chartex" xmlns:cx8="http://schemas.microsoft.com/office/drawing/2016/5/14/chartex" xmlns:mc="http://schemas.openxmlformats.org/markup-compatibility/2006" xmlns:aink="http://schemas.microsoft.com/office/drawing/2016/ink" xmlns:am3d="http://schemas.microsoft.com/office/drawing/2017/model3d" xmlns:o="urn:schemas-microsoft-com:office:office" xmlns:oel="http://schemas.microsoft.com/office/2019/extlst" xmlns:r="http://schemas.openxmlformats.org/officeDocument/2006/relationships" xmlns:m="http://schemas.openxmlformats.org/officeDocument/2006/math" xmlns:v="urn:schemas-microsoft-com:vml" xmlns:wp14="http://schemas.microsoft.com/office/word/2010/wordprocessingDrawing" xmlns:wp="http://schemas.openxmlformats.org/drawingml/2006/wordprocessingDrawing" xmlns:w10="urn:schemas-microsoft-com:office:word" xmlns:w="http://schemas.openxmlformats.org/wordprocessingml/2006/main" xmlns:w14="http://schemas.microsoft.com/office/word/2010/wordml" xmlns:w15="http://schemas.microsoft.com/office/word/2012/wordml" xmlns:w16cex="http://schemas.microsoft.com/office/word/2018/wordml/cex" xmlns:w16cid="http://schemas.microsoft.com/office/word/2016/wordml/cid" xmlns:w16="http://schemas.microsoft.com/office/word/2018/wordml" xmlns:w16du="http://schemas.microsoft.com/office/word/2023/wordml/word16du" xmlns:w16sdtdh="http://schemas.microsoft.com/office/word/2020/wordml/sdtdatahash" xmlns:w16sdtfl="http://schemas.microsoft.com/office/word/2024/wordml/sdtformatlock" xmlns:w16se="http://schemas.microsoft.com/office/word/2015/wordml/symex" xmlns:wpg="http://schemas.microsoft.com/office/word/2010/wordprocessingGroup" xmlns:wpi="http://schemas.microsoft.com/office/word/2010/wordprocessingInk" xmlns:wne="http://schemas.microsoft.com/office/word/2006/wordml" xmlns:wps="http://schemas.microsoft.com/office/word/2010/wordprocessingShape" mc:Ignorable="w14 w15 w16se w16cid w16 w16cex w16sdtdh w16sdtfl w16du wp14">
+  <w:p>
+    <w:pPr>
+      <w:pStyle w:val="Rodap"/>
       <w:jc w:val="center"/>
+      <w:rPr>
+        <w:rFonts w:hint="eastAsia"/>
+      </w:rPr>
     </w:pPr>
     <w:r>
       <w:rPr>
@@ -22134,7 +22281,7 @@
 </w:ftr>
 </file>
 
-<file path=word/footer2.xml><?xml version="1.0" encoding="utf-8"?>
+<file path=word/footer3.xml><?xml version="1.0" encoding="utf-8"?>
 <w:ftr xmlns:wpc="http://schemas.microsoft.com/office/word/2010/wordprocessingCanvas" xmlns:cx="http://schemas.microsoft.com/office/drawing/2014/chartex" xmlns:cx1="http://schemas.microsoft.com/office/drawing/2015/9/8/chartex" xmlns:cx2="http://schemas.microsoft.com/office/drawing/2015/10/21/chartex" xmlns:cx3="http://schemas.microsoft.com/office/drawing/2016/5/9/chartex" xmlns:cx4="http://schemas.microsoft.com/office/drawing/2016/5/10/chartex" xmlns:cx5="http://schemas.microsoft.com/office/drawing/2016/5/11/chartex" xmlns:cx6="http://schemas.microsoft.com/office/drawing/2016/5/12/chartex" xmlns:cx7="http://schemas.microsoft.com/office/drawing/2016/5/13/chartex" xmlns:cx8="http://schemas.microsoft.com/office/drawing/2016/5/14/chartex" xmlns:mc="http://schemas.openxmlformats.org/markup-compatibility/2006" xmlns:aink="http://schemas.microsoft.com/office/drawing/2016/ink" xmlns:am3d="http://schemas.microsoft.com/office/drawing/2017/model3d" xmlns:o="urn:schemas-microsoft-com:office:office" xmlns:oel="http://schemas.microsoft.com/office/2019/extlst" xmlns:r="http://schemas.openxmlformats.org/officeDocument/2006/relationships" xmlns:m="http://schemas.openxmlformats.org/officeDocument/2006/math" xmlns:v="urn:schemas-microsoft-com:vml" xmlns:wp14="http://schemas.microsoft.com/office/word/2010/wordprocessingDrawing" xmlns:wp="http://schemas.openxmlformats.org/drawingml/2006/wordprocessingDrawing" xmlns:w10="urn:schemas-microsoft-com:office:word" xmlns:w="http://schemas.openxmlformats.org/wordprocessingml/2006/main" xmlns:w14="http://schemas.microsoft.com/office/word/2010/wordml" xmlns:w15="http://schemas.microsoft.com/office/word/2012/wordml" xmlns:w16cex="http://schemas.microsoft.com/office/word/2018/wordml/cex" xmlns:w16cid="http://schemas.microsoft.com/office/word/2016/wordml/cid" xmlns:w16="http://schemas.microsoft.com/office/word/2018/wordml" xmlns:w16du="http://schemas.microsoft.com/office/word/2023/wordml/word16du" xmlns:w16sdtdh="http://schemas.microsoft.com/office/word/2020/wordml/sdtdatahash" xmlns:w16sdtfl="http://schemas.microsoft.com/office/word/2024/wordml/sdtformatlock" xmlns:w16se="http://schemas.microsoft.com/office/word/2015/wordml/symex" xmlns:wpg="http://schemas.microsoft.com/office/word/2010/wordprocessingGroup" xmlns:wpi="http://schemas.microsoft.com/office/word/2010/wordprocessingInk" xmlns:wne="http://schemas.microsoft.com/office/word/2006/wordml" xmlns:wps="http://schemas.microsoft.com/office/word/2010/wordprocessingShape" mc:Ignorable="w14 w15 w16se w16cid w16 w16cex w16sdtdh w16sdtfl w16du wp14">
   <w:tbl>
     <w:tblPr>
@@ -22151,7 +22298,7 @@
     </w:tblPr>
     <w:tblGrid>
       <w:gridCol w:w="1670"/>
-      <w:gridCol w:w="3118"/>
+      <w:gridCol w:w="3709"/>
     </w:tblGrid>
     <w:tr>
       <w:tc>
@@ -22201,7 +22348,7 @@
       </w:tc>
       <w:tc>
         <w:tcPr>
-          <w:tcW w:w="3118" w:type="dxa"/>
+          <w:tcW w:w="3709" w:type="dxa"/>
           <w:shd w:val="clear" w:color="auto" w:fill="F5F9FF"/>
           <w:tcMar>
             <w:top w:w="90" w:type="dxa"/>
@@ -22297,7 +22444,7 @@
       </w:tc>
       <w:tc>
         <w:tcPr>
-          <w:tcW w:w="3118" w:type="dxa"/>
+          <w:tcW w:w="3709" w:type="dxa"/>
           <w:shd w:val="clear" w:color="auto" w:fill="F5F9FF"/>
           <w:tcMar>
             <w:top w:w="90" w:type="dxa"/>
@@ -22432,6 +22579,7 @@
       <w:pStyle w:val="Notadiscreta"/>
       <w:jc w:val="right"/>
       <w:rPr>
+        <w:rFonts w:hint="eastAsia"/>
         <w:b/>
         <w:color w:val="EEECE1" w:themeColor="background2"/>
         <w:spacing w:val="10"/>
@@ -22454,6 +22602,7 @@
       <w:pStyle w:val="Notadiscreta"/>
       <w:jc w:val="right"/>
       <w:rPr>
+        <w:rFonts w:hint="eastAsia"/>
         <w:b/>
         <w:color w:val="EEECE1" w:themeColor="background2"/>
         <w:spacing w:val="10"/>
@@ -22476,6 +22625,7 @@
       <w:pStyle w:val="Notadiscreta"/>
       <w:jc w:val="right"/>
       <w:rPr>
+        <w:rFonts w:hint="eastAsia"/>
         <w:b/>
         <w:color w:val="EEECE1" w:themeColor="background2"/>
         <w:spacing w:val="10"/>
@@ -22498,6 +22648,7 @@
       <w:pStyle w:val="Notadiscreta"/>
       <w:jc w:val="right"/>
       <w:rPr>
+        <w:rFonts w:hint="eastAsia"/>
         <w:b/>
         <w:color w:val="EEECE1" w:themeColor="background2"/>
         <w:spacing w:val="10"/>
@@ -22520,6 +22671,7 @@
       <w:pStyle w:val="Notadiscreta"/>
       <w:jc w:val="right"/>
       <w:rPr>
+        <w:rFonts w:hint="eastAsia"/>
         <w:b/>
         <w:color w:val="EEECE1" w:themeColor="background2"/>
         <w:spacing w:val="10"/>
@@ -22542,6 +22694,7 @@
       <w:pStyle w:val="Notadiscreta"/>
       <w:jc w:val="right"/>
       <w:rPr>
+        <w:rFonts w:hint="eastAsia"/>
         <w:b/>
         <w:color w:val="EEECE1" w:themeColor="background2"/>
         <w:spacing w:val="10"/>
@@ -22564,6 +22717,7 @@
       <w:pStyle w:val="Notadiscreta"/>
       <w:jc w:val="right"/>
       <w:rPr>
+        <w:rFonts w:hint="eastAsia"/>
         <w:b/>
         <w:color w:val="EEECE1" w:themeColor="background2"/>
         <w:spacing w:val="10"/>
@@ -22766,22 +22920,28 @@
 </w:ftr>
 </file>
 
-<file path=word/footer3.xml><?xml version="1.0" encoding="utf-8"?>
+<file path=word/footer4.xml><?xml version="1.0" encoding="utf-8"?>
 <w:ftr xmlns:wpc="http://schemas.microsoft.com/office/word/2010/wordprocessingCanvas" xmlns:cx="http://schemas.microsoft.com/office/drawing/2014/chartex" xmlns:cx1="http://schemas.microsoft.com/office/drawing/2015/9/8/chartex" xmlns:cx2="http://schemas.microsoft.com/office/drawing/2015/10/21/chartex" xmlns:cx3="http://schemas.microsoft.com/office/drawing/2016/5/9/chartex" xmlns:cx4="http://schemas.microsoft.com/office/drawing/2016/5/10/chartex" xmlns:cx5="http://schemas.microsoft.com/office/drawing/2016/5/11/chartex" xmlns:cx6="http://schemas.microsoft.com/office/drawing/2016/5/12/chartex" xmlns:cx7="http://schemas.microsoft.com/office/drawing/2016/5/13/chartex" xmlns:cx8="http://schemas.microsoft.com/office/drawing/2016/5/14/chartex" xmlns:mc="http://schemas.openxmlformats.org/markup-compatibility/2006" xmlns:aink="http://schemas.microsoft.com/office/drawing/2016/ink" xmlns:am3d="http://schemas.microsoft.com/office/drawing/2017/model3d" xmlns:o="urn:schemas-microsoft-com:office:office" xmlns:oel="http://schemas.microsoft.com/office/2019/extlst" xmlns:r="http://schemas.openxmlformats.org/officeDocument/2006/relationships" xmlns:m="http://schemas.openxmlformats.org/officeDocument/2006/math" xmlns:v="urn:schemas-microsoft-com:vml" xmlns:wp14="http://schemas.microsoft.com/office/word/2010/wordprocessingDrawing" xmlns:wp="http://schemas.openxmlformats.org/drawingml/2006/wordprocessingDrawing" xmlns:w10="urn:schemas-microsoft-com:office:word" xmlns:w="http://schemas.openxmlformats.org/wordprocessingml/2006/main" xmlns:w14="http://schemas.microsoft.com/office/word/2010/wordml" xmlns:w15="http://schemas.microsoft.com/office/word/2012/wordml" xmlns:w16cex="http://schemas.microsoft.com/office/word/2018/wordml/cex" xmlns:w16cid="http://schemas.microsoft.com/office/word/2016/wordml/cid" xmlns:w16="http://schemas.microsoft.com/office/word/2018/wordml" xmlns:w16du="http://schemas.microsoft.com/office/word/2023/wordml/word16du" xmlns:w16sdtdh="http://schemas.microsoft.com/office/word/2020/wordml/sdtdatahash" xmlns:w16sdtfl="http://schemas.microsoft.com/office/word/2024/wordml/sdtformatlock" xmlns:w16se="http://schemas.microsoft.com/office/word/2015/wordml/symex" xmlns:wpg="http://schemas.microsoft.com/office/word/2010/wordprocessingGroup" xmlns:wpi="http://schemas.microsoft.com/office/word/2010/wordprocessingInk" xmlns:wne="http://schemas.microsoft.com/office/word/2006/wordml" xmlns:wps="http://schemas.microsoft.com/office/word/2010/wordprocessingShape" mc:Ignorable="w14 w15 w16se w16cid w16 w16cex w16sdtdh w16sdtfl w16du wp14">
   <w:p>
     <w:pPr>
       <w:pStyle w:val="Rodap"/>
+      <w:rPr>
+        <w:rFonts w:hint="eastAsia"/>
+      </w:rPr>
     </w:pPr>
   </w:p>
 </w:ftr>
 </file>
 
-<file path=word/footer4.xml><?xml version="1.0" encoding="utf-8"?>
+<file path=word/footer5.xml><?xml version="1.0" encoding="utf-8"?>
 <w:ftr xmlns:wpc="http://schemas.microsoft.com/office/word/2010/wordprocessingCanvas" xmlns:cx="http://schemas.microsoft.com/office/drawing/2014/chartex" xmlns:cx1="http://schemas.microsoft.com/office/drawing/2015/9/8/chartex" xmlns:cx2="http://schemas.microsoft.com/office/drawing/2015/10/21/chartex" xmlns:cx3="http://schemas.microsoft.com/office/drawing/2016/5/9/chartex" xmlns:cx4="http://schemas.microsoft.com/office/drawing/2016/5/10/chartex" xmlns:cx5="http://schemas.microsoft.com/office/drawing/2016/5/11/chartex" xmlns:cx6="http://schemas.microsoft.com/office/drawing/2016/5/12/chartex" xmlns:cx7="http://schemas.microsoft.com/office/drawing/2016/5/13/chartex" xmlns:cx8="http://schemas.microsoft.com/office/drawing/2016/5/14/chartex" xmlns:mc="http://schemas.openxmlformats.org/markup-compatibility/2006" xmlns:aink="http://schemas.microsoft.com/office/drawing/2016/ink" xmlns:am3d="http://schemas.microsoft.com/office/drawing/2017/model3d" xmlns:o="urn:schemas-microsoft-com:office:office" xmlns:oel="http://schemas.microsoft.com/office/2019/extlst" xmlns:r="http://schemas.openxmlformats.org/officeDocument/2006/relationships" xmlns:m="http://schemas.openxmlformats.org/officeDocument/2006/math" xmlns:v="urn:schemas-microsoft-com:vml" xmlns:wp14="http://schemas.microsoft.com/office/word/2010/wordprocessingDrawing" xmlns:wp="http://schemas.openxmlformats.org/drawingml/2006/wordprocessingDrawing" xmlns:w10="urn:schemas-microsoft-com:office:word" xmlns:w="http://schemas.openxmlformats.org/wordprocessingml/2006/main" xmlns:w14="http://schemas.microsoft.com/office/word/2010/wordml" xmlns:w15="http://schemas.microsoft.com/office/word/2012/wordml" xmlns:w16cex="http://schemas.microsoft.com/office/word/2018/wordml/cex" xmlns:w16cid="http://schemas.microsoft.com/office/word/2016/wordml/cid" xmlns:w16="http://schemas.microsoft.com/office/word/2018/wordml" xmlns:w16du="http://schemas.microsoft.com/office/word/2023/wordml/word16du" xmlns:w16sdtdh="http://schemas.microsoft.com/office/word/2020/wordml/sdtdatahash" xmlns:w16sdtfl="http://schemas.microsoft.com/office/word/2024/wordml/sdtformatlock" xmlns:w16se="http://schemas.microsoft.com/office/word/2015/wordml/symex" xmlns:wpg="http://schemas.microsoft.com/office/word/2010/wordprocessingGroup" xmlns:wpi="http://schemas.microsoft.com/office/word/2010/wordprocessingInk" xmlns:wne="http://schemas.microsoft.com/office/word/2006/wordml" xmlns:wps="http://schemas.microsoft.com/office/word/2010/wordprocessingShape" mc:Ignorable="w14 w15 w16se w16cid w16 w16cex w16sdtdh w16sdtfl w16du wp14">
   <w:p>
     <w:pPr>
       <w:pStyle w:val="Rodap"/>
       <w:jc w:val="center"/>
+      <w:rPr>
+        <w:rFonts w:hint="eastAsia"/>
+      </w:rPr>
     </w:pPr>
     <w:r>
       <w:rPr>
@@ -22812,12 +22972,15 @@
 </w:ftr>
 </file>
 
-<file path=word/footer5.xml><?xml version="1.0" encoding="utf-8"?>
+<file path=word/footer6.xml><?xml version="1.0" encoding="utf-8"?>
 <w:ftr xmlns:wpc="http://schemas.microsoft.com/office/word/2010/wordprocessingCanvas" xmlns:cx="http://schemas.microsoft.com/office/drawing/2014/chartex" xmlns:cx1="http://schemas.microsoft.com/office/drawing/2015/9/8/chartex" xmlns:cx2="http://schemas.microsoft.com/office/drawing/2015/10/21/chartex" xmlns:cx3="http://schemas.microsoft.com/office/drawing/2016/5/9/chartex" xmlns:cx4="http://schemas.microsoft.com/office/drawing/2016/5/10/chartex" xmlns:cx5="http://schemas.microsoft.com/office/drawing/2016/5/11/chartex" xmlns:cx6="http://schemas.microsoft.com/office/drawing/2016/5/12/chartex" xmlns:cx7="http://schemas.microsoft.com/office/drawing/2016/5/13/chartex" xmlns:cx8="http://schemas.microsoft.com/office/drawing/2016/5/14/chartex" xmlns:mc="http://schemas.openxmlformats.org/markup-compatibility/2006" xmlns:aink="http://schemas.microsoft.com/office/drawing/2016/ink" xmlns:am3d="http://schemas.microsoft.com/office/drawing/2017/model3d" xmlns:o="urn:schemas-microsoft-com:office:office" xmlns:oel="http://schemas.microsoft.com/office/2019/extlst" xmlns:r="http://schemas.openxmlformats.org/officeDocument/2006/relationships" xmlns:m="http://schemas.openxmlformats.org/officeDocument/2006/math" xmlns:v="urn:schemas-microsoft-com:vml" xmlns:wp14="http://schemas.microsoft.com/office/word/2010/wordprocessingDrawing" xmlns:wp="http://schemas.openxmlformats.org/drawingml/2006/wordprocessingDrawing" xmlns:w10="urn:schemas-microsoft-com:office:word" xmlns:w="http://schemas.openxmlformats.org/wordprocessingml/2006/main" xmlns:w14="http://schemas.microsoft.com/office/word/2010/wordml" xmlns:w15="http://schemas.microsoft.com/office/word/2012/wordml" xmlns:w16cex="http://schemas.microsoft.com/office/word/2018/wordml/cex" xmlns:w16cid="http://schemas.microsoft.com/office/word/2016/wordml/cid" xmlns:w16="http://schemas.microsoft.com/office/word/2018/wordml" xmlns:w16du="http://schemas.microsoft.com/office/word/2023/wordml/word16du" xmlns:w16sdtdh="http://schemas.microsoft.com/office/word/2020/wordml/sdtdatahash" xmlns:w16sdtfl="http://schemas.microsoft.com/office/word/2024/wordml/sdtformatlock" xmlns:w16se="http://schemas.microsoft.com/office/word/2015/wordml/symex" xmlns:wpg="http://schemas.microsoft.com/office/word/2010/wordprocessingGroup" xmlns:wpi="http://schemas.microsoft.com/office/word/2010/wordprocessingInk" xmlns:wne="http://schemas.microsoft.com/office/word/2006/wordml" xmlns:wps="http://schemas.microsoft.com/office/word/2010/wordprocessingShape" mc:Ignorable="w14 w15 w16se w16cid w16 w16cex w16sdtdh w16sdtfl w16du wp14">
   <w:p>
     <w:pPr>
       <w:pStyle w:val="Rodap"/>
       <w:jc w:val="center"/>
+      <w:rPr>
+        <w:rFonts w:hint="eastAsia"/>
+      </w:rPr>
     </w:pPr>
     <w:r>
       <w:rPr>
@@ -22854,6 +23017,9 @@
     <w:p>
       <w:pPr>
         <w:spacing w:after="0"/>
+        <w:rPr>
+          <w:rFonts w:hint="eastAsia"/>
+        </w:rPr>
       </w:pPr>
       <w:r>
         <w:separator/>
@@ -22864,6 +23030,9 @@
     <w:p>
       <w:pPr>
         <w:spacing w:after="0"/>
+        <w:rPr>
+          <w:rFonts w:hint="eastAsia"/>
+        </w:rPr>
       </w:pPr>
       <w:r>
         <w:continuationSeparator/>
@@ -22878,7 +23047,23 @@
   <w:p>
     <w:pPr>
       <w:pStyle w:val="Cabealho"/>
+      <w:rPr>
+        <w:rFonts w:hint="eastAsia"/>
+      </w:rPr>
+    </w:pPr>
+  </w:p>
+</w:hdr>
+</file>
+
+<file path=word/header2.xml><?xml version="1.0" encoding="utf-8"?>
+<w:hdr xmlns:wpc="http://schemas.microsoft.com/office/word/2010/wordprocessingCanvas" xmlns:cx="http://schemas.microsoft.com/office/drawing/2014/chartex" xmlns:cx1="http://schemas.microsoft.com/office/drawing/2015/9/8/chartex" xmlns:cx2="http://schemas.microsoft.com/office/drawing/2015/10/21/chartex" xmlns:cx3="http://schemas.microsoft.com/office/drawing/2016/5/9/chartex" xmlns:cx4="http://schemas.microsoft.com/office/drawing/2016/5/10/chartex" xmlns:cx5="http://schemas.microsoft.com/office/drawing/2016/5/11/chartex" xmlns:cx6="http://schemas.microsoft.com/office/drawing/2016/5/12/chartex" xmlns:cx7="http://schemas.microsoft.com/office/drawing/2016/5/13/chartex" xmlns:cx8="http://schemas.microsoft.com/office/drawing/2016/5/14/chartex" xmlns:mc="http://schemas.openxmlformats.org/markup-compatibility/2006" xmlns:aink="http://schemas.microsoft.com/office/drawing/2016/ink" xmlns:am3d="http://schemas.microsoft.com/office/drawing/2017/model3d" xmlns:o="urn:schemas-microsoft-com:office:office" xmlns:oel="http://schemas.microsoft.com/office/2019/extlst" xmlns:r="http://schemas.openxmlformats.org/officeDocument/2006/relationships" xmlns:m="http://schemas.openxmlformats.org/officeDocument/2006/math" xmlns:v="urn:schemas-microsoft-com:vml" xmlns:wp14="http://schemas.microsoft.com/office/word/2010/wordprocessingDrawing" xmlns:wp="http://schemas.openxmlformats.org/drawingml/2006/wordprocessingDrawing" xmlns:w10="urn:schemas-microsoft-com:office:word" xmlns:w="http://schemas.openxmlformats.org/wordprocessingml/2006/main" xmlns:w14="http://schemas.microsoft.com/office/word/2010/wordml" xmlns:w15="http://schemas.microsoft.com/office/word/2012/wordml" xmlns:w16cex="http://schemas.microsoft.com/office/word/2018/wordml/cex" xmlns:w16cid="http://schemas.microsoft.com/office/word/2016/wordml/cid" xmlns:w16="http://schemas.microsoft.com/office/word/2018/wordml" xmlns:w16du="http://schemas.microsoft.com/office/word/2023/wordml/word16du" xmlns:w16sdtdh="http://schemas.microsoft.com/office/word/2020/wordml/sdtdatahash" xmlns:w16sdtfl="http://schemas.microsoft.com/office/word/2024/wordml/sdtformatlock" xmlns:w16se="http://schemas.microsoft.com/office/word/2015/wordml/symex" xmlns:wpg="http://schemas.microsoft.com/office/word/2010/wordprocessingGroup" xmlns:wpi="http://schemas.microsoft.com/office/word/2010/wordprocessingInk" xmlns:wne="http://schemas.microsoft.com/office/word/2006/wordml" xmlns:wps="http://schemas.microsoft.com/office/word/2010/wordprocessingShape" mc:Ignorable="w14 w15 w16se w16cid w16 w16cex w16sdtdh w16sdtfl w16du wp14">
+  <w:p>
+    <w:pPr>
+      <w:pStyle w:val="Cabealho"/>
       <w:jc w:val="right"/>
+      <w:rPr>
+        <w:rFonts w:hint="eastAsia"/>
+      </w:rPr>
     </w:pPr>
     <w:r>
       <w:rPr>
@@ -22910,7 +23095,7 @@
 </w:hdr>
 </file>
 
-<file path=word/header2.xml><?xml version="1.0" encoding="utf-8"?>
+<file path=word/header3.xml><?xml version="1.0" encoding="utf-8"?>
 <w:hdr xmlns:wpc="http://schemas.microsoft.com/office/word/2010/wordprocessingCanvas" xmlns:cx="http://schemas.microsoft.com/office/drawing/2014/chartex" xmlns:cx1="http://schemas.microsoft.com/office/drawing/2015/9/8/chartex" xmlns:cx2="http://schemas.microsoft.com/office/drawing/2015/10/21/chartex" xmlns:cx3="http://schemas.microsoft.com/office/drawing/2016/5/9/chartex" xmlns:cx4="http://schemas.microsoft.com/office/drawing/2016/5/10/chartex" xmlns:cx5="http://schemas.microsoft.com/office/drawing/2016/5/11/chartex" xmlns:cx6="http://schemas.microsoft.com/office/drawing/2016/5/12/chartex" xmlns:cx7="http://schemas.microsoft.com/office/drawing/2016/5/13/chartex" xmlns:cx8="http://schemas.microsoft.com/office/drawing/2016/5/14/chartex" xmlns:mc="http://schemas.openxmlformats.org/markup-compatibility/2006" xmlns:aink="http://schemas.microsoft.com/office/drawing/2016/ink" xmlns:am3d="http://schemas.microsoft.com/office/drawing/2017/model3d" xmlns:o="urn:schemas-microsoft-com:office:office" xmlns:oel="http://schemas.microsoft.com/office/2019/extlst" xmlns:r="http://schemas.openxmlformats.org/officeDocument/2006/relationships" xmlns:m="http://schemas.openxmlformats.org/officeDocument/2006/math" xmlns:v="urn:schemas-microsoft-com:vml" xmlns:wp14="http://schemas.microsoft.com/office/word/2010/wordprocessingDrawing" xmlns:wp="http://schemas.openxmlformats.org/drawingml/2006/wordprocessingDrawing" xmlns:w10="urn:schemas-microsoft-com:office:word" xmlns:w="http://schemas.openxmlformats.org/wordprocessingml/2006/main" xmlns:w14="http://schemas.microsoft.com/office/word/2010/wordml" xmlns:w15="http://schemas.microsoft.com/office/word/2012/wordml" xmlns:w16cex="http://schemas.microsoft.com/office/word/2018/wordml/cex" xmlns:w16cid="http://schemas.microsoft.com/office/word/2016/wordml/cid" xmlns:w16="http://schemas.microsoft.com/office/word/2018/wordml" xmlns:w16du="http://schemas.microsoft.com/office/word/2023/wordml/word16du" xmlns:w16sdtdh="http://schemas.microsoft.com/office/word/2020/wordml/sdtdatahash" xmlns:w16sdtfl="http://schemas.microsoft.com/office/word/2024/wordml/sdtformatlock" xmlns:w16se="http://schemas.microsoft.com/office/word/2015/wordml/symex" xmlns:wpg="http://schemas.microsoft.com/office/word/2010/wordprocessingGroup" xmlns:wpi="http://schemas.microsoft.com/office/word/2010/wordprocessingInk" xmlns:wne="http://schemas.microsoft.com/office/word/2006/wordml" xmlns:wps="http://schemas.microsoft.com/office/word/2010/wordprocessingShape" mc:Ignorable="w14 w15 w16se w16cid w16 w16cex w16sdtdh w16sdtfl w16du wp14">
   <w:p>
     <w:pPr>
@@ -23027,6 +23212,7 @@
     <w:pPr>
       <w:pStyle w:val="Introduo"/>
       <w:rPr>
+        <w:rFonts w:hint="eastAsia"/>
         <w:lang w:val="pt-PT"/>
       </w:rPr>
     </w:pPr>
@@ -23040,11 +23226,14 @@
 </w:hdr>
 </file>
 
-<file path=word/header3.xml><?xml version="1.0" encoding="utf-8"?>
+<file path=word/header4.xml><?xml version="1.0" encoding="utf-8"?>
 <w:hdr xmlns:wpc="http://schemas.microsoft.com/office/word/2010/wordprocessingCanvas" xmlns:cx="http://schemas.microsoft.com/office/drawing/2014/chartex" xmlns:cx1="http://schemas.microsoft.com/office/drawing/2015/9/8/chartex" xmlns:cx2="http://schemas.microsoft.com/office/drawing/2015/10/21/chartex" xmlns:cx3="http://schemas.microsoft.com/office/drawing/2016/5/9/chartex" xmlns:cx4="http://schemas.microsoft.com/office/drawing/2016/5/10/chartex" xmlns:cx5="http://schemas.microsoft.com/office/drawing/2016/5/11/chartex" xmlns:cx6="http://schemas.microsoft.com/office/drawing/2016/5/12/chartex" xmlns:cx7="http://schemas.microsoft.com/office/drawing/2016/5/13/chartex" xmlns:cx8="http://schemas.microsoft.com/office/drawing/2016/5/14/chartex" xmlns:mc="http://schemas.openxmlformats.org/markup-compatibility/2006" xmlns:aink="http://schemas.microsoft.com/office/drawing/2016/ink" xmlns:am3d="http://schemas.microsoft.com/office/drawing/2017/model3d" xmlns:o="urn:schemas-microsoft-com:office:office" xmlns:oel="http://schemas.microsoft.com/office/2019/extlst" xmlns:r="http://schemas.openxmlformats.org/officeDocument/2006/relationships" xmlns:m="http://schemas.openxmlformats.org/officeDocument/2006/math" xmlns:v="urn:schemas-microsoft-com:vml" xmlns:wp14="http://schemas.microsoft.com/office/word/2010/wordprocessingDrawing" xmlns:wp="http://schemas.openxmlformats.org/drawingml/2006/wordprocessingDrawing" xmlns:w10="urn:schemas-microsoft-com:office:word" xmlns:w="http://schemas.openxmlformats.org/wordprocessingml/2006/main" xmlns:w14="http://schemas.microsoft.com/office/word/2010/wordml" xmlns:w15="http://schemas.microsoft.com/office/word/2012/wordml" xmlns:w16cex="http://schemas.microsoft.com/office/word/2018/wordml/cex" xmlns:w16cid="http://schemas.microsoft.com/office/word/2016/wordml/cid" xmlns:w16="http://schemas.microsoft.com/office/word/2018/wordml" xmlns:w16du="http://schemas.microsoft.com/office/word/2023/wordml/word16du" xmlns:w16sdtdh="http://schemas.microsoft.com/office/word/2020/wordml/sdtdatahash" xmlns:w16sdtfl="http://schemas.microsoft.com/office/word/2024/wordml/sdtformatlock" xmlns:w16se="http://schemas.microsoft.com/office/word/2015/wordml/symex" xmlns:wpg="http://schemas.microsoft.com/office/word/2010/wordprocessingGroup" xmlns:wpi="http://schemas.microsoft.com/office/word/2010/wordprocessingInk" xmlns:wne="http://schemas.microsoft.com/office/word/2006/wordml" xmlns:wps="http://schemas.microsoft.com/office/word/2010/wordprocessingShape" mc:Ignorable="w14 w15 w16se w16cid w16 w16cex w16sdtdh w16sdtfl w16du wp14">
   <w:p>
     <w:pPr>
       <w:pStyle w:val="Cabealho"/>
+      <w:rPr>
+        <w:rFonts w:hint="eastAsia"/>
+      </w:rPr>
     </w:pPr>
   </w:p>
 </w:hdr>
@@ -24615,6 +24804,7 @@
   <w:style w:type="character" w:default="1" w:styleId="Tipodeletrapredefinidodopargrafo">
     <w:name w:val="Default Paragraph Font"/>
     <w:uiPriority w:val="1"/>
+    <w:semiHidden/>
     <w:unhideWhenUsed/>
   </w:style>
   <w:style w:type="table" w:default="1" w:styleId="Tabelanormal">

</xml_diff>